<commit_message>
Added cache control instructions
cache control instructions added. If the previous experiment to the run is the other one, it will load in even though you have put the correct working directory and done everything right!
</commit_message>
<xml_diff>
--- a/FEP_Verbal_Instructions.docx
+++ b/FEP_Verbal_Instructions.docx
@@ -23,6 +23,17 @@
           <w:szCs w:val="32"/>
           <w:u w:val="single"/>
         </w:rPr>
+        <w:t xml:space="preserve"> </w:t>
+      </w:r>
+      <w:r>
+        <w:rPr>
+          <w:rFonts w:ascii="Calibri" w:hAnsi="Calibri" w:cs="Calibri"/>
+          <w:b/>
+          <w:bCs/>
+          <w:sz w:val="32"/>
+          <w:szCs w:val="32"/>
+          <w:u w:val="single"/>
+        </w:rPr>
         <w:t>FEP Procedure</w:t>
       </w:r>
     </w:p>
@@ -42,7 +53,27 @@
           <w:szCs w:val="28"/>
           <w:u w:val="single"/>
         </w:rPr>
-        <w:t>Setting up LabRecorder LSL</w:t>
+        <w:t xml:space="preserve">Setting up </w:t>
+      </w:r>
+      <w:proofErr w:type="spellStart"/>
+      <w:r>
+        <w:rPr>
+          <w:rFonts w:ascii="Calibri" w:hAnsi="Calibri" w:cs="Calibri"/>
+          <w:sz w:val="28"/>
+          <w:szCs w:val="28"/>
+          <w:u w:val="single"/>
+        </w:rPr>
+        <w:t>LabRecorder</w:t>
+      </w:r>
+      <w:proofErr w:type="spellEnd"/>
+      <w:r>
+        <w:rPr>
+          <w:rFonts w:ascii="Calibri" w:hAnsi="Calibri" w:cs="Calibri"/>
+          <w:sz w:val="28"/>
+          <w:szCs w:val="28"/>
+          <w:u w:val="single"/>
+        </w:rPr>
+        <w:t xml:space="preserve"> LSL</w:t>
       </w:r>
     </w:p>
     <w:p>
@@ -345,6 +376,7 @@
           <w:szCs w:val="28"/>
         </w:rPr>
       </w:pPr>
+      <w:proofErr w:type="gramStart"/>
       <w:r>
         <w:rPr>
           <w:rFonts w:ascii="Calibri" w:hAnsi="Calibri" w:cs="Calibri"/>
@@ -359,7 +391,16 @@
           <w:sz w:val="28"/>
           <w:szCs w:val="28"/>
         </w:rPr>
-        <w:t xml:space="preserve">Tell PP to read info and then indicate </w:t>
+        <w:t>Tell</w:t>
+      </w:r>
+      <w:proofErr w:type="gramEnd"/>
+      <w:r>
+        <w:rPr>
+          <w:rFonts w:ascii="Calibri" w:hAnsi="Calibri" w:cs="Calibri"/>
+          <w:sz w:val="28"/>
+          <w:szCs w:val="28"/>
+        </w:rPr>
+        <w:t xml:space="preserve"> PP to read info and then indicate </w:t>
       </w:r>
       <w:r>
         <w:rPr>
@@ -526,6 +567,7 @@
           <w:szCs w:val="28"/>
         </w:rPr>
       </w:pPr>
+      <w:proofErr w:type="gramStart"/>
       <w:r>
         <w:rPr>
           <w:rFonts w:ascii="Calibri" w:hAnsi="Calibri" w:cs="Calibri"/>
@@ -540,7 +582,16 @@
           <w:sz w:val="28"/>
           <w:szCs w:val="28"/>
         </w:rPr>
-        <w:t xml:space="preserve">Resting period </w:t>
+        <w:t>Resting</w:t>
+      </w:r>
+      <w:proofErr w:type="gramEnd"/>
+      <w:r>
+        <w:rPr>
+          <w:rFonts w:ascii="Calibri" w:hAnsi="Calibri" w:cs="Calibri"/>
+          <w:sz w:val="28"/>
+          <w:szCs w:val="28"/>
+        </w:rPr>
+        <w:t xml:space="preserve"> period </w:t>
       </w:r>
       <w:r>
         <w:rPr>
@@ -580,6 +631,7 @@
           <w:szCs w:val="28"/>
         </w:rPr>
       </w:pPr>
+      <w:proofErr w:type="gramStart"/>
       <w:r>
         <w:rPr>
           <w:rFonts w:ascii="Calibri" w:hAnsi="Calibri" w:cs="Calibri"/>
@@ -594,7 +646,16 @@
           <w:sz w:val="28"/>
           <w:szCs w:val="28"/>
         </w:rPr>
-        <w:t xml:space="preserve">Relax, </w:t>
+        <w:t>Relax</w:t>
+      </w:r>
+      <w:proofErr w:type="gramEnd"/>
+      <w:r>
+        <w:rPr>
+          <w:rFonts w:ascii="Calibri" w:hAnsi="Calibri" w:cs="Calibri"/>
+          <w:sz w:val="28"/>
+          <w:szCs w:val="28"/>
+        </w:rPr>
+        <w:t xml:space="preserve">, </w:t>
       </w:r>
       <w:r>
         <w:rPr>
@@ -656,6 +717,7 @@
           <w:szCs w:val="28"/>
         </w:rPr>
       </w:pPr>
+      <w:proofErr w:type="gramStart"/>
       <w:r>
         <w:rPr>
           <w:rFonts w:ascii="Calibri" w:hAnsi="Calibri" w:cs="Calibri"/>
@@ -670,7 +732,16 @@
           <w:sz w:val="28"/>
           <w:szCs w:val="28"/>
         </w:rPr>
-        <w:t>You will hear a beep when this resting period has ended</w:t>
+        <w:t>You</w:t>
+      </w:r>
+      <w:proofErr w:type="gramEnd"/>
+      <w:r>
+        <w:rPr>
+          <w:rFonts w:ascii="Calibri" w:hAnsi="Calibri" w:cs="Calibri"/>
+          <w:sz w:val="28"/>
+          <w:szCs w:val="28"/>
+        </w:rPr>
+        <w:t xml:space="preserve"> will hear a beep when this resting period has ended</w:t>
       </w:r>
     </w:p>
     <w:p>
@@ -686,6 +757,7 @@
           <w:szCs w:val="28"/>
         </w:rPr>
       </w:pPr>
+      <w:proofErr w:type="gramStart"/>
       <w:r>
         <w:rPr>
           <w:rFonts w:ascii="Calibri" w:hAnsi="Calibri" w:cs="Calibri"/>
@@ -700,7 +772,16 @@
           <w:sz w:val="28"/>
           <w:szCs w:val="28"/>
         </w:rPr>
-        <w:t xml:space="preserve">Read through, </w:t>
+        <w:t>Read</w:t>
+      </w:r>
+      <w:proofErr w:type="gramEnd"/>
+      <w:r>
+        <w:rPr>
+          <w:rFonts w:ascii="Calibri" w:hAnsi="Calibri" w:cs="Calibri"/>
+          <w:sz w:val="28"/>
+          <w:szCs w:val="28"/>
+        </w:rPr>
+        <w:t xml:space="preserve"> through, </w:t>
       </w:r>
       <w:r>
         <w:rPr>
@@ -953,6 +1034,7 @@
           <w:szCs w:val="28"/>
         </w:rPr>
       </w:pPr>
+      <w:proofErr w:type="gramStart"/>
       <w:r>
         <w:rPr>
           <w:rFonts w:ascii="Calibri" w:hAnsi="Calibri" w:cs="Calibri"/>
@@ -967,7 +1049,16 @@
           <w:sz w:val="28"/>
           <w:szCs w:val="28"/>
         </w:rPr>
-        <w:t>Press “</w:t>
+        <w:t>Press</w:t>
+      </w:r>
+      <w:proofErr w:type="gramEnd"/>
+      <w:r>
+        <w:rPr>
+          <w:rFonts w:ascii="Calibri" w:hAnsi="Calibri" w:cs="Calibri"/>
+          <w:sz w:val="28"/>
+          <w:szCs w:val="28"/>
+        </w:rPr>
+        <w:t xml:space="preserve"> “</w:t>
       </w:r>
       <w:r>
         <w:rPr>
@@ -1135,6 +1226,7 @@
           <w:szCs w:val="28"/>
         </w:rPr>
       </w:pPr>
+      <w:proofErr w:type="gramStart"/>
       <w:r>
         <w:rPr>
           <w:rFonts w:ascii="Calibri" w:hAnsi="Calibri" w:cs="Calibri"/>
@@ -1149,7 +1241,16 @@
           <w:sz w:val="28"/>
           <w:szCs w:val="28"/>
         </w:rPr>
-        <w:t>Tell PP to answer questions on “About yourself” section</w:t>
+        <w:t>Tell</w:t>
+      </w:r>
+      <w:proofErr w:type="gramEnd"/>
+      <w:r>
+        <w:rPr>
+          <w:rFonts w:ascii="Calibri" w:hAnsi="Calibri" w:cs="Calibri"/>
+          <w:sz w:val="28"/>
+          <w:szCs w:val="28"/>
+        </w:rPr>
+        <w:t xml:space="preserve"> PP to answer questions on “About yourself” section</w:t>
       </w:r>
       <w:r>
         <w:rPr>
@@ -1207,6 +1308,7 @@
           <w:szCs w:val="28"/>
         </w:rPr>
       </w:pPr>
+      <w:proofErr w:type="gramStart"/>
       <w:r>
         <w:rPr>
           <w:rFonts w:ascii="Calibri" w:hAnsi="Calibri" w:cs="Calibri"/>
@@ -1221,7 +1323,16 @@
           <w:sz w:val="28"/>
           <w:szCs w:val="28"/>
         </w:rPr>
-        <w:t xml:space="preserve">Ensure </w:t>
+        <w:t>Ensure</w:t>
+      </w:r>
+      <w:proofErr w:type="gramEnd"/>
+      <w:r>
+        <w:rPr>
+          <w:rFonts w:ascii="Calibri" w:hAnsi="Calibri" w:cs="Calibri"/>
+          <w:sz w:val="28"/>
+          <w:szCs w:val="28"/>
+        </w:rPr>
+        <w:t xml:space="preserve"> </w:t>
       </w:r>
       <w:r>
         <w:rPr>
@@ -1269,6 +1380,7 @@
           <w:szCs w:val="28"/>
         </w:rPr>
       </w:pPr>
+      <w:proofErr w:type="gramStart"/>
       <w:r>
         <w:rPr>
           <w:rFonts w:ascii="Calibri" w:hAnsi="Calibri" w:cs="Calibri"/>
@@ -1283,7 +1395,16 @@
           <w:sz w:val="28"/>
           <w:szCs w:val="28"/>
         </w:rPr>
-        <w:t xml:space="preserve">INSTRUCTIONS: firstly, you will see some black dots, which you must click on using the mouse. </w:t>
+        <w:t>INSTRUCTIONS</w:t>
+      </w:r>
+      <w:proofErr w:type="gramEnd"/>
+      <w:r>
+        <w:rPr>
+          <w:rFonts w:ascii="Calibri" w:hAnsi="Calibri" w:cs="Calibri"/>
+          <w:sz w:val="28"/>
+          <w:szCs w:val="28"/>
+        </w:rPr>
+        <w:t xml:space="preserve">: firstly, you will see some black dots, which you must click on using the mouse. </w:t>
       </w:r>
       <w:r>
         <w:rPr>
@@ -1331,6 +1452,7 @@
           <w:szCs w:val="28"/>
         </w:rPr>
       </w:pPr>
+      <w:proofErr w:type="gramStart"/>
       <w:r>
         <w:rPr>
           <w:rFonts w:ascii="Calibri" w:hAnsi="Calibri" w:cs="Calibri"/>
@@ -1347,7 +1469,17 @@
           <w:szCs w:val="28"/>
           <w:highlight w:val="yellow"/>
         </w:rPr>
-        <w:t>Let me know when you have finished the gaze calibration</w:t>
+        <w:t>Let</w:t>
+      </w:r>
+      <w:proofErr w:type="gramEnd"/>
+      <w:r>
+        <w:rPr>
+          <w:rFonts w:ascii="Calibri" w:hAnsi="Calibri" w:cs="Calibri"/>
+          <w:sz w:val="28"/>
+          <w:szCs w:val="28"/>
+          <w:highlight w:val="yellow"/>
+        </w:rPr>
+        <w:t xml:space="preserve"> me know when you have finished the gaze calibration</w:t>
       </w:r>
     </w:p>
     <w:p>
@@ -1456,6 +1588,7 @@
           <w:szCs w:val="28"/>
         </w:rPr>
       </w:pPr>
+      <w:proofErr w:type="gramStart"/>
       <w:r>
         <w:rPr>
           <w:rFonts w:ascii="Calibri" w:hAnsi="Calibri" w:cs="Calibri"/>
@@ -1470,7 +1603,16 @@
           <w:sz w:val="28"/>
           <w:szCs w:val="28"/>
         </w:rPr>
-        <w:t>This section gives background information about the following task</w:t>
+        <w:t>This</w:t>
+      </w:r>
+      <w:proofErr w:type="gramEnd"/>
+      <w:r>
+        <w:rPr>
+          <w:rFonts w:ascii="Calibri" w:hAnsi="Calibri" w:cs="Calibri"/>
+          <w:sz w:val="28"/>
+          <w:szCs w:val="28"/>
+        </w:rPr>
+        <w:t xml:space="preserve"> section gives background information about the following task</w:t>
       </w:r>
     </w:p>
     <w:p>
@@ -1486,6 +1628,7 @@
           <w:szCs w:val="28"/>
         </w:rPr>
       </w:pPr>
+      <w:proofErr w:type="gramStart"/>
       <w:r>
         <w:rPr>
           <w:rFonts w:ascii="Calibri" w:hAnsi="Calibri" w:cs="Calibri"/>
@@ -1501,7 +1644,16 @@
           <w:sz w:val="28"/>
           <w:szCs w:val="28"/>
         </w:rPr>
-        <w:t xml:space="preserve">Please read and then </w:t>
+        <w:t>Please</w:t>
+      </w:r>
+      <w:proofErr w:type="gramEnd"/>
+      <w:r>
+        <w:rPr>
+          <w:rFonts w:ascii="Calibri" w:hAnsi="Calibri" w:cs="Calibri"/>
+          <w:sz w:val="28"/>
+          <w:szCs w:val="28"/>
+        </w:rPr>
+        <w:t xml:space="preserve"> read and then </w:t>
       </w:r>
       <w:r>
         <w:rPr>
@@ -1635,6 +1787,7 @@
           <w:szCs w:val="28"/>
         </w:rPr>
       </w:pPr>
+      <w:proofErr w:type="gramStart"/>
       <w:r>
         <w:rPr>
           <w:rFonts w:ascii="Calibri" w:hAnsi="Calibri" w:cs="Calibri"/>
@@ -1649,7 +1802,16 @@
           <w:sz w:val="28"/>
           <w:szCs w:val="28"/>
         </w:rPr>
-        <w:t>Here, you will see erotic images with labels flashing up before each picture. Each image will be labelled as either “</w:t>
+        <w:t>Here</w:t>
+      </w:r>
+      <w:proofErr w:type="gramEnd"/>
+      <w:r>
+        <w:rPr>
+          <w:rFonts w:ascii="Calibri" w:hAnsi="Calibri" w:cs="Calibri"/>
+          <w:sz w:val="28"/>
+          <w:szCs w:val="28"/>
+        </w:rPr>
+        <w:t>, you will see erotic images with labels flashing up before each picture. Each image will be labelled as either “</w:t>
       </w:r>
       <w:r>
         <w:rPr>
@@ -1709,6 +1871,7 @@
           <w:szCs w:val="28"/>
         </w:rPr>
       </w:pPr>
+      <w:proofErr w:type="gramStart"/>
       <w:r>
         <w:rPr>
           <w:rFonts w:ascii="Calibri" w:hAnsi="Calibri" w:cs="Calibri"/>
@@ -1723,7 +1886,16 @@
           <w:sz w:val="28"/>
           <w:szCs w:val="28"/>
         </w:rPr>
-        <w:t xml:space="preserve">You will </w:t>
+        <w:t>You</w:t>
+      </w:r>
+      <w:proofErr w:type="gramEnd"/>
+      <w:r>
+        <w:rPr>
+          <w:rFonts w:ascii="Calibri" w:hAnsi="Calibri" w:cs="Calibri"/>
+          <w:sz w:val="28"/>
+          <w:szCs w:val="28"/>
+        </w:rPr>
+        <w:t xml:space="preserve"> will </w:t>
       </w:r>
       <w:r>
         <w:rPr>
@@ -1877,6 +2049,7 @@
           <w:szCs w:val="28"/>
         </w:rPr>
       </w:pPr>
+      <w:proofErr w:type="gramStart"/>
       <w:r>
         <w:rPr>
           <w:rFonts w:ascii="Calibri" w:hAnsi="Calibri" w:cs="Calibri"/>
@@ -1899,7 +2072,16 @@
           <w:sz w:val="28"/>
           <w:szCs w:val="28"/>
         </w:rPr>
-        <w:t xml:space="preserve">nswer </w:t>
+        <w:t>nswer</w:t>
+      </w:r>
+      <w:proofErr w:type="gramEnd"/>
+      <w:r>
+        <w:rPr>
+          <w:rFonts w:ascii="Calibri" w:hAnsi="Calibri" w:cs="Calibri"/>
+          <w:sz w:val="28"/>
+          <w:szCs w:val="28"/>
+        </w:rPr>
+        <w:t xml:space="preserve"> </w:t>
       </w:r>
       <w:r>
         <w:rPr>
@@ -1931,6 +2113,7 @@
           <w:szCs w:val="28"/>
         </w:rPr>
       </w:pPr>
+      <w:proofErr w:type="gramStart"/>
       <w:r>
         <w:rPr>
           <w:rFonts w:ascii="Calibri" w:hAnsi="Calibri" w:cs="Calibri"/>
@@ -1947,6 +2130,7 @@
         </w:rPr>
         <w:t>Please</w:t>
       </w:r>
+      <w:proofErr w:type="gramEnd"/>
       <w:r>
         <w:rPr>
           <w:rFonts w:ascii="Calibri" w:hAnsi="Calibri" w:cs="Calibri"/>
@@ -2283,6 +2467,7 @@
           <w:szCs w:val="28"/>
         </w:rPr>
       </w:pPr>
+      <w:proofErr w:type="gramStart"/>
       <w:r>
         <w:rPr>
           <w:rFonts w:ascii="Calibri" w:hAnsi="Calibri" w:cs="Calibri"/>
@@ -2297,7 +2482,16 @@
           <w:sz w:val="28"/>
           <w:szCs w:val="28"/>
         </w:rPr>
-        <w:t>Now, please answer the following questionnaires (</w:t>
+        <w:t>Now</w:t>
+      </w:r>
+      <w:proofErr w:type="gramEnd"/>
+      <w:r>
+        <w:rPr>
+          <w:rFonts w:ascii="Calibri" w:hAnsi="Calibri" w:cs="Calibri"/>
+          <w:sz w:val="28"/>
+          <w:szCs w:val="28"/>
+        </w:rPr>
+        <w:t>, please answer the following questionnaires (</w:t>
       </w:r>
       <w:r>
         <w:rPr>
@@ -2443,6 +2637,7 @@
           <w:szCs w:val="28"/>
         </w:rPr>
       </w:pPr>
+      <w:proofErr w:type="gramStart"/>
       <w:r>
         <w:rPr>
           <w:rFonts w:ascii="Calibri" w:hAnsi="Calibri" w:cs="Calibri"/>
@@ -2457,15 +2652,42 @@
           <w:sz w:val="28"/>
           <w:szCs w:val="28"/>
         </w:rPr>
-        <w:t>So, t</w:t>
-      </w:r>
-      <w:r>
-        <w:rPr>
-          <w:rFonts w:ascii="Calibri" w:hAnsi="Calibri" w:cs="Calibri"/>
-          <w:sz w:val="28"/>
-          <w:szCs w:val="28"/>
-        </w:rPr>
-        <w:t>he AI-generated/Photograph labels you saw in the previous erotic stimuli task were actually mixed-up, meaning that they were not assigned correctly for every picture</w:t>
+        <w:t>So</w:t>
+      </w:r>
+      <w:proofErr w:type="gramEnd"/>
+      <w:r>
+        <w:rPr>
+          <w:rFonts w:ascii="Calibri" w:hAnsi="Calibri" w:cs="Calibri"/>
+          <w:sz w:val="28"/>
+          <w:szCs w:val="28"/>
+        </w:rPr>
+        <w:t>, t</w:t>
+      </w:r>
+      <w:r>
+        <w:rPr>
+          <w:rFonts w:ascii="Calibri" w:hAnsi="Calibri" w:cs="Calibri"/>
+          <w:sz w:val="28"/>
+          <w:szCs w:val="28"/>
+        </w:rPr>
+        <w:t xml:space="preserve">he AI-generated/Photograph labels you saw in the previous erotic stimuli task were </w:t>
+      </w:r>
+      <w:proofErr w:type="gramStart"/>
+      <w:r>
+        <w:rPr>
+          <w:rFonts w:ascii="Calibri" w:hAnsi="Calibri" w:cs="Calibri"/>
+          <w:sz w:val="28"/>
+          <w:szCs w:val="28"/>
+        </w:rPr>
+        <w:t>actually mixed-up</w:t>
+      </w:r>
+      <w:proofErr w:type="gramEnd"/>
+      <w:r>
+        <w:rPr>
+          <w:rFonts w:ascii="Calibri" w:hAnsi="Calibri" w:cs="Calibri"/>
+          <w:sz w:val="28"/>
+          <w:szCs w:val="28"/>
+        </w:rPr>
+        <w:t>, meaning that they were not assigned correctly for every picture</w:t>
       </w:r>
     </w:p>
     <w:p>
@@ -2481,6 +2703,7 @@
           <w:szCs w:val="28"/>
         </w:rPr>
       </w:pPr>
+      <w:proofErr w:type="gramStart"/>
       <w:r>
         <w:rPr>
           <w:rFonts w:ascii="Calibri" w:hAnsi="Calibri" w:cs="Calibri"/>
@@ -2495,7 +2718,16 @@
           <w:sz w:val="28"/>
           <w:szCs w:val="28"/>
         </w:rPr>
-        <w:t xml:space="preserve">Here, we need you to </w:t>
+        <w:t>Here</w:t>
+      </w:r>
+      <w:proofErr w:type="gramEnd"/>
+      <w:r>
+        <w:rPr>
+          <w:rFonts w:ascii="Calibri" w:hAnsi="Calibri" w:cs="Calibri"/>
+          <w:sz w:val="28"/>
+          <w:szCs w:val="28"/>
+        </w:rPr>
+        <w:t xml:space="preserve">, we need you to </w:t>
       </w:r>
       <w:r>
         <w:rPr>
@@ -2587,6 +2819,7 @@
           <w:szCs w:val="28"/>
         </w:rPr>
       </w:pPr>
+      <w:proofErr w:type="gramStart"/>
       <w:r>
         <w:rPr>
           <w:rFonts w:ascii="Calibri" w:hAnsi="Calibri" w:cs="Calibri"/>
@@ -2601,7 +2834,16 @@
           <w:sz w:val="28"/>
           <w:szCs w:val="28"/>
         </w:rPr>
-        <w:t>Again, go with your gut reaction – DO NOT OVERTHINK IT</w:t>
+        <w:t>Again</w:t>
+      </w:r>
+      <w:proofErr w:type="gramEnd"/>
+      <w:r>
+        <w:rPr>
+          <w:rFonts w:ascii="Calibri" w:hAnsi="Calibri" w:cs="Calibri"/>
+          <w:sz w:val="28"/>
+          <w:szCs w:val="28"/>
+        </w:rPr>
+        <w:t>, go with your gut reaction – DO NOT OVERTHINK IT</w:t>
       </w:r>
     </w:p>
     <w:p>
@@ -2617,6 +2859,7 @@
           <w:szCs w:val="28"/>
         </w:rPr>
       </w:pPr>
+      <w:proofErr w:type="gramStart"/>
       <w:r>
         <w:rPr>
           <w:rFonts w:ascii="Calibri" w:hAnsi="Calibri" w:cs="Calibri"/>
@@ -2631,7 +2874,16 @@
           <w:sz w:val="28"/>
           <w:szCs w:val="28"/>
         </w:rPr>
-        <w:t>Read through this s</w:t>
+        <w:t>Read</w:t>
+      </w:r>
+      <w:proofErr w:type="gramEnd"/>
+      <w:r>
+        <w:rPr>
+          <w:rFonts w:ascii="Calibri" w:hAnsi="Calibri" w:cs="Calibri"/>
+          <w:sz w:val="28"/>
+          <w:szCs w:val="28"/>
+        </w:rPr>
+        <w:t xml:space="preserve"> through this s</w:t>
       </w:r>
       <w:r>
         <w:rPr>
@@ -2782,6 +3034,7 @@
           <w:szCs w:val="28"/>
         </w:rPr>
       </w:pPr>
+      <w:proofErr w:type="gramStart"/>
       <w:r>
         <w:rPr>
           <w:rFonts w:ascii="Calibri" w:hAnsi="Calibri" w:cs="Calibri"/>
@@ -2796,7 +3049,16 @@
           <w:sz w:val="28"/>
           <w:szCs w:val="28"/>
         </w:rPr>
-        <w:t>Here, you can see a rotating arm that creates a green circle</w:t>
+        <w:t>Here</w:t>
+      </w:r>
+      <w:proofErr w:type="gramEnd"/>
+      <w:r>
+        <w:rPr>
+          <w:rFonts w:ascii="Calibri" w:hAnsi="Calibri" w:cs="Calibri"/>
+          <w:sz w:val="28"/>
+          <w:szCs w:val="28"/>
+        </w:rPr>
+        <w:t>, you can see a rotating arm that creates a green circle</w:t>
       </w:r>
       <w:r>
         <w:rPr>
@@ -2880,6 +3142,7 @@
           <w:szCs w:val="28"/>
         </w:rPr>
       </w:pPr>
+      <w:proofErr w:type="gramStart"/>
       <w:r>
         <w:rPr>
           <w:rFonts w:ascii="Calibri" w:hAnsi="Calibri" w:cs="Calibri"/>
@@ -2894,7 +3157,16 @@
           <w:sz w:val="28"/>
           <w:szCs w:val="28"/>
         </w:rPr>
-        <w:t xml:space="preserve">Read through the instructions and </w:t>
+        <w:t>Read</w:t>
+      </w:r>
+      <w:proofErr w:type="gramEnd"/>
+      <w:r>
+        <w:rPr>
+          <w:rFonts w:ascii="Calibri" w:hAnsi="Calibri" w:cs="Calibri"/>
+          <w:sz w:val="28"/>
+          <w:szCs w:val="28"/>
+        </w:rPr>
+        <w:t xml:space="preserve"> through the instructions and </w:t>
       </w:r>
       <w:r>
         <w:rPr>
@@ -2963,6 +3235,7 @@
           <w:szCs w:val="28"/>
         </w:rPr>
       </w:pPr>
+      <w:proofErr w:type="gramStart"/>
       <w:r>
         <w:rPr>
           <w:rFonts w:ascii="Calibri" w:hAnsi="Calibri" w:cs="Calibri"/>
@@ -2977,7 +3250,16 @@
           <w:sz w:val="28"/>
           <w:szCs w:val="28"/>
         </w:rPr>
-        <w:t xml:space="preserve">Now, you will see another task where a rotating arm creates a blue circle (upon </w:t>
+        <w:t>Now</w:t>
+      </w:r>
+      <w:proofErr w:type="gramEnd"/>
+      <w:r>
+        <w:rPr>
+          <w:rFonts w:ascii="Calibri" w:hAnsi="Calibri" w:cs="Calibri"/>
+          <w:sz w:val="28"/>
+          <w:szCs w:val="28"/>
+        </w:rPr>
+        <w:t xml:space="preserve">, you will see another task where a rotating arm creates a blue circle (upon </w:t>
       </w:r>
       <w:r>
         <w:rPr>
@@ -3025,6 +3307,7 @@
           <w:szCs w:val="28"/>
         </w:rPr>
       </w:pPr>
+      <w:proofErr w:type="gramStart"/>
       <w:r>
         <w:rPr>
           <w:rFonts w:ascii="Calibri" w:hAnsi="Calibri" w:cs="Calibri"/>
@@ -3039,7 +3322,16 @@
           <w:sz w:val="28"/>
           <w:szCs w:val="28"/>
         </w:rPr>
-        <w:t>Please read through the instructions and p</w:t>
+        <w:t>Please</w:t>
+      </w:r>
+      <w:proofErr w:type="gramEnd"/>
+      <w:r>
+        <w:rPr>
+          <w:rFonts w:ascii="Calibri" w:hAnsi="Calibri" w:cs="Calibri"/>
+          <w:sz w:val="28"/>
+          <w:szCs w:val="28"/>
+        </w:rPr>
+        <w:t xml:space="preserve"> read through the instructions and p</w:t>
       </w:r>
       <w:r>
         <w:rPr>
@@ -3145,6 +3437,7 @@
           <w:szCs w:val="28"/>
         </w:rPr>
       </w:pPr>
+      <w:proofErr w:type="gramStart"/>
       <w:r>
         <w:rPr>
           <w:rFonts w:ascii="Calibri" w:hAnsi="Calibri" w:cs="Calibri"/>
@@ -3159,7 +3452,16 @@
           <w:sz w:val="28"/>
           <w:szCs w:val="28"/>
         </w:rPr>
-        <w:t xml:space="preserve">Here, you will see a </w:t>
+        <w:t>Here</w:t>
+      </w:r>
+      <w:proofErr w:type="gramEnd"/>
+      <w:r>
+        <w:rPr>
+          <w:rFonts w:ascii="Calibri" w:hAnsi="Calibri" w:cs="Calibri"/>
+          <w:sz w:val="28"/>
+          <w:szCs w:val="28"/>
+        </w:rPr>
+        <w:t xml:space="preserve">, you will see a </w:t>
       </w:r>
       <w:r>
         <w:rPr>
@@ -3191,6 +3493,7 @@
           <w:szCs w:val="28"/>
         </w:rPr>
       </w:pPr>
+      <w:proofErr w:type="gramStart"/>
       <w:r>
         <w:rPr>
           <w:rFonts w:ascii="Calibri" w:hAnsi="Calibri" w:cs="Calibri"/>
@@ -3205,7 +3508,16 @@
           <w:sz w:val="28"/>
           <w:szCs w:val="28"/>
         </w:rPr>
-        <w:t xml:space="preserve">So, you have the </w:t>
+        <w:t>So</w:t>
+      </w:r>
+      <w:proofErr w:type="gramEnd"/>
+      <w:r>
+        <w:rPr>
+          <w:rFonts w:ascii="Calibri" w:hAnsi="Calibri" w:cs="Calibri"/>
+          <w:sz w:val="28"/>
+          <w:szCs w:val="28"/>
+        </w:rPr>
+        <w:t xml:space="preserve">, you have the </w:t>
       </w:r>
       <w:r>
         <w:rPr>
@@ -3304,6 +3616,7 @@
           <w:szCs w:val="28"/>
         </w:rPr>
       </w:pPr>
+      <w:proofErr w:type="gramStart"/>
       <w:r>
         <w:rPr>
           <w:rFonts w:ascii="Calibri" w:hAnsi="Calibri" w:cs="Calibri"/>
@@ -3318,7 +3631,16 @@
           <w:sz w:val="28"/>
           <w:szCs w:val="28"/>
         </w:rPr>
-        <w:t xml:space="preserve">And you have the </w:t>
+        <w:t>And</w:t>
+      </w:r>
+      <w:proofErr w:type="gramEnd"/>
+      <w:r>
+        <w:rPr>
+          <w:rFonts w:ascii="Calibri" w:hAnsi="Calibri" w:cs="Calibri"/>
+          <w:sz w:val="28"/>
+          <w:szCs w:val="28"/>
+        </w:rPr>
+        <w:t xml:space="preserve"> you have the </w:t>
       </w:r>
       <w:r>
         <w:rPr>
@@ -3385,6 +3707,7 @@
           <w:szCs w:val="28"/>
         </w:rPr>
       </w:pPr>
+      <w:proofErr w:type="gramStart"/>
       <w:r>
         <w:rPr>
           <w:rFonts w:ascii="Calibri" w:hAnsi="Calibri" w:cs="Calibri"/>
@@ -3399,7 +3722,16 @@
           <w:sz w:val="28"/>
           <w:szCs w:val="28"/>
         </w:rPr>
-        <w:t>Feel free to</w:t>
+        <w:t>Feel</w:t>
+      </w:r>
+      <w:proofErr w:type="gramEnd"/>
+      <w:r>
+        <w:rPr>
+          <w:rFonts w:ascii="Calibri" w:hAnsi="Calibri" w:cs="Calibri"/>
+          <w:sz w:val="28"/>
+          <w:szCs w:val="28"/>
+        </w:rPr>
+        <w:t xml:space="preserve"> free to</w:t>
       </w:r>
       <w:r>
         <w:rPr>
@@ -3532,6 +3864,7 @@
           <w:szCs w:val="28"/>
         </w:rPr>
       </w:pPr>
+      <w:proofErr w:type="gramStart"/>
       <w:r>
         <w:rPr>
           <w:rFonts w:ascii="Calibri" w:hAnsi="Calibri" w:cs="Calibri"/>
@@ -3547,7 +3880,16 @@
           <w:sz w:val="28"/>
           <w:szCs w:val="28"/>
         </w:rPr>
-        <w:t>You will now hear some beeps. You need to tap the spacebar in time with these beeps to match their rhythm as best as you can</w:t>
+        <w:t>You</w:t>
+      </w:r>
+      <w:proofErr w:type="gramEnd"/>
+      <w:r>
+        <w:rPr>
+          <w:rFonts w:ascii="Calibri" w:hAnsi="Calibri" w:cs="Calibri"/>
+          <w:sz w:val="28"/>
+          <w:szCs w:val="28"/>
+        </w:rPr>
+        <w:t xml:space="preserve"> will now hear some beeps. You need to tap the spacebar in time with these beeps to match their rhythm as best as you can</w:t>
       </w:r>
     </w:p>
     <w:p>
@@ -3563,6 +3905,7 @@
           <w:szCs w:val="28"/>
         </w:rPr>
       </w:pPr>
+      <w:proofErr w:type="gramStart"/>
       <w:r>
         <w:rPr>
           <w:rFonts w:ascii="Calibri" w:hAnsi="Calibri" w:cs="Calibri"/>
@@ -3577,7 +3920,16 @@
           <w:sz w:val="28"/>
           <w:szCs w:val="28"/>
         </w:rPr>
-        <w:t>These beeps will then stop but you must keep tapping the spacebar at th</w:t>
+        <w:t>These</w:t>
+      </w:r>
+      <w:proofErr w:type="gramEnd"/>
+      <w:r>
+        <w:rPr>
+          <w:rFonts w:ascii="Calibri" w:hAnsi="Calibri" w:cs="Calibri"/>
+          <w:sz w:val="28"/>
+          <w:szCs w:val="28"/>
+        </w:rPr>
+        <w:t xml:space="preserve"> beeps will then stop but you must keep tapping the spacebar at th</w:t>
       </w:r>
       <w:r>
         <w:rPr>
@@ -3625,6 +3977,7 @@
           <w:szCs w:val="28"/>
         </w:rPr>
       </w:pPr>
+      <w:proofErr w:type="gramStart"/>
       <w:r>
         <w:rPr>
           <w:rFonts w:ascii="Calibri" w:hAnsi="Calibri" w:cs="Calibri"/>
@@ -3639,7 +3992,16 @@
           <w:sz w:val="28"/>
           <w:szCs w:val="28"/>
         </w:rPr>
-        <w:t>Read through the instructions in full and then carry on when you are ready</w:t>
+        <w:t>Read</w:t>
+      </w:r>
+      <w:proofErr w:type="gramEnd"/>
+      <w:r>
+        <w:rPr>
+          <w:rFonts w:ascii="Calibri" w:hAnsi="Calibri" w:cs="Calibri"/>
+          <w:sz w:val="28"/>
+          <w:szCs w:val="28"/>
+        </w:rPr>
+        <w:t xml:space="preserve"> through the instructions in full and then carry on when you are ready</w:t>
       </w:r>
     </w:p>
     <w:p>
@@ -3742,6 +4104,7 @@
           <w:szCs w:val="28"/>
         </w:rPr>
       </w:pPr>
+      <w:proofErr w:type="gramStart"/>
       <w:r>
         <w:rPr>
           <w:rFonts w:ascii="Calibri" w:hAnsi="Calibri" w:cs="Calibri"/>
@@ -3756,7 +4119,16 @@
           <w:sz w:val="28"/>
           <w:szCs w:val="28"/>
         </w:rPr>
-        <w:t>Now, you need to tap the spacebar as randomly as you can, avoiding consecutive taps</w:t>
+        <w:t>Now</w:t>
+      </w:r>
+      <w:proofErr w:type="gramEnd"/>
+      <w:r>
+        <w:rPr>
+          <w:rFonts w:ascii="Calibri" w:hAnsi="Calibri" w:cs="Calibri"/>
+          <w:sz w:val="28"/>
+          <w:szCs w:val="28"/>
+        </w:rPr>
+        <w:t>, you need to tap the spacebar as randomly as you can, avoiding consecutive taps</w:t>
       </w:r>
     </w:p>
     <w:p>
@@ -3772,6 +4144,7 @@
           <w:szCs w:val="28"/>
         </w:rPr>
       </w:pPr>
+      <w:proofErr w:type="gramStart"/>
       <w:r>
         <w:rPr>
           <w:rFonts w:ascii="Calibri" w:hAnsi="Calibri" w:cs="Calibri"/>
@@ -3786,7 +4159,16 @@
           <w:sz w:val="28"/>
           <w:szCs w:val="28"/>
         </w:rPr>
-        <w:t>Again, please read through the instructions and continue when you are ready</w:t>
+        <w:t>Again</w:t>
+      </w:r>
+      <w:proofErr w:type="gramEnd"/>
+      <w:r>
+        <w:rPr>
+          <w:rFonts w:ascii="Calibri" w:hAnsi="Calibri" w:cs="Calibri"/>
+          <w:sz w:val="28"/>
+          <w:szCs w:val="28"/>
+        </w:rPr>
+        <w:t>, please read through the instructions and continue when you are ready</w:t>
       </w:r>
     </w:p>
     <w:p>
@@ -3914,6 +4296,7 @@
           <w:szCs w:val="28"/>
         </w:rPr>
       </w:pPr>
+      <w:proofErr w:type="gramStart"/>
       <w:r>
         <w:rPr>
           <w:rFonts w:ascii="Calibri" w:hAnsi="Calibri" w:cs="Calibri"/>
@@ -3928,7 +4311,16 @@
           <w:sz w:val="28"/>
           <w:szCs w:val="28"/>
         </w:rPr>
-        <w:t>Here, you now need to tap the spacebar whenever you feel a heartbeat</w:t>
+        <w:t>Here</w:t>
+      </w:r>
+      <w:proofErr w:type="gramEnd"/>
+      <w:r>
+        <w:rPr>
+          <w:rFonts w:ascii="Calibri" w:hAnsi="Calibri" w:cs="Calibri"/>
+          <w:sz w:val="28"/>
+          <w:szCs w:val="28"/>
+        </w:rPr>
+        <w:t>, you now need to tap the spacebar whenever you feel a heartbeat</w:t>
       </w:r>
       <w:r>
         <w:rPr>
@@ -3937,6 +4329,24 @@
           <w:szCs w:val="28"/>
         </w:rPr>
         <w:t xml:space="preserve">, </w:t>
+      </w:r>
+      <w:r>
+        <w:rPr>
+          <w:rFonts w:ascii="Calibri" w:hAnsi="Calibri" w:cs="Calibri"/>
+          <w:i/>
+          <w:iCs/>
+          <w:sz w:val="28"/>
+          <w:szCs w:val="28"/>
+        </w:rPr>
+        <w:t>or when you think your heart is beating.</w:t>
+      </w:r>
+      <w:r>
+        <w:rPr>
+          <w:rFonts w:ascii="Calibri" w:hAnsi="Calibri" w:cs="Calibri"/>
+          <w:sz w:val="28"/>
+          <w:szCs w:val="28"/>
+        </w:rPr>
+        <w:t xml:space="preserve"> </w:t>
       </w:r>
       <w:r>
         <w:rPr>
@@ -3984,6 +4394,7 @@
           <w:szCs w:val="28"/>
         </w:rPr>
       </w:pPr>
+      <w:proofErr w:type="gramStart"/>
       <w:r>
         <w:rPr>
           <w:rFonts w:ascii="Calibri" w:hAnsi="Calibri" w:cs="Calibri"/>
@@ -3998,7 +4409,16 @@
           <w:sz w:val="28"/>
           <w:szCs w:val="28"/>
         </w:rPr>
-        <w:t>Read the instructions and continue when you are ready</w:t>
+        <w:t>Read</w:t>
+      </w:r>
+      <w:proofErr w:type="gramEnd"/>
+      <w:r>
+        <w:rPr>
+          <w:rFonts w:ascii="Calibri" w:hAnsi="Calibri" w:cs="Calibri"/>
+          <w:sz w:val="28"/>
+          <w:szCs w:val="28"/>
+        </w:rPr>
+        <w:t xml:space="preserve"> the instructions and continue when you are ready</w:t>
       </w:r>
     </w:p>
     <w:p>
@@ -4073,7 +4493,6 @@
           <w:highlight w:val="yellow"/>
           <w:u w:val="single"/>
         </w:rPr>
-        <w:lastRenderedPageBreak/>
         <w:t>INTEROCEPTION: HCT</w:t>
       </w:r>
       <w:r>
@@ -4111,6 +4530,7 @@
           <w:szCs w:val="28"/>
         </w:rPr>
       </w:pPr>
+      <w:proofErr w:type="gramStart"/>
       <w:r>
         <w:rPr>
           <w:rFonts w:ascii="Calibri" w:hAnsi="Calibri" w:cs="Calibri"/>
@@ -4125,7 +4545,16 @@
           <w:sz w:val="28"/>
           <w:szCs w:val="28"/>
         </w:rPr>
-        <w:t xml:space="preserve">Now, you must count the number of heartbeats you </w:t>
+        <w:t>Now</w:t>
+      </w:r>
+      <w:proofErr w:type="gramEnd"/>
+      <w:r>
+        <w:rPr>
+          <w:rFonts w:ascii="Calibri" w:hAnsi="Calibri" w:cs="Calibri"/>
+          <w:sz w:val="28"/>
+          <w:szCs w:val="28"/>
+        </w:rPr>
+        <w:t xml:space="preserve">, you must count the number of heartbeats you </w:t>
       </w:r>
       <w:r>
         <w:rPr>
@@ -4157,6 +4586,7 @@
           <w:szCs w:val="28"/>
         </w:rPr>
       </w:pPr>
+      <w:proofErr w:type="gramStart"/>
       <w:r>
         <w:rPr>
           <w:rFonts w:ascii="Calibri" w:hAnsi="Calibri" w:cs="Calibri"/>
@@ -4171,7 +4601,16 @@
           <w:sz w:val="28"/>
           <w:szCs w:val="28"/>
         </w:rPr>
-        <w:t>Again, please do this without physically measuring your heart or pulse, in the position you are in now</w:t>
+        <w:t>Again</w:t>
+      </w:r>
+      <w:proofErr w:type="gramEnd"/>
+      <w:r>
+        <w:rPr>
+          <w:rFonts w:ascii="Calibri" w:hAnsi="Calibri" w:cs="Calibri"/>
+          <w:sz w:val="28"/>
+          <w:szCs w:val="28"/>
+        </w:rPr>
+        <w:t>, please do this without physically measuring your heart or pulse, in the position you are in now</w:t>
       </w:r>
     </w:p>
     <w:p>
@@ -4187,6 +4626,7 @@
           <w:szCs w:val="28"/>
         </w:rPr>
       </w:pPr>
+      <w:proofErr w:type="gramStart"/>
       <w:r>
         <w:rPr>
           <w:rFonts w:ascii="Calibri" w:hAnsi="Calibri" w:cs="Calibri"/>
@@ -4202,7 +4642,17 @@
           <w:szCs w:val="28"/>
           <w:highlight w:val="yellow"/>
         </w:rPr>
-        <w:t>Please l</w:t>
+        <w:t>Please</w:t>
+      </w:r>
+      <w:proofErr w:type="gramEnd"/>
+      <w:r>
+        <w:rPr>
+          <w:rFonts w:ascii="Calibri" w:hAnsi="Calibri" w:cs="Calibri"/>
+          <w:sz w:val="28"/>
+          <w:szCs w:val="28"/>
+          <w:highlight w:val="yellow"/>
+        </w:rPr>
+        <w:t xml:space="preserve"> l</w:t>
       </w:r>
       <w:r>
         <w:rPr>
@@ -4344,6 +4794,7 @@
           <w:szCs w:val="28"/>
         </w:rPr>
       </w:pPr>
+      <w:proofErr w:type="gramStart"/>
       <w:r>
         <w:rPr>
           <w:rFonts w:ascii="Calibri" w:hAnsi="Calibri" w:cs="Calibri"/>
@@ -4358,7 +4809,16 @@
           <w:sz w:val="28"/>
           <w:szCs w:val="28"/>
         </w:rPr>
-        <w:t>Read the following instructions and continue to answer the questionnaires</w:t>
+        <w:t>Read</w:t>
+      </w:r>
+      <w:proofErr w:type="gramEnd"/>
+      <w:r>
+        <w:rPr>
+          <w:rFonts w:ascii="Calibri" w:hAnsi="Calibri" w:cs="Calibri"/>
+          <w:sz w:val="28"/>
+          <w:szCs w:val="28"/>
+        </w:rPr>
+        <w:t xml:space="preserve"> the following instructions and continue to answer the questionnaires</w:t>
       </w:r>
     </w:p>
     <w:p>
@@ -4407,6 +4867,7 @@
           <w:szCs w:val="28"/>
         </w:rPr>
       </w:pPr>
+      <w:proofErr w:type="gramStart"/>
       <w:r>
         <w:rPr>
           <w:rFonts w:ascii="Calibri" w:hAnsi="Calibri" w:cs="Calibri"/>
@@ -4421,7 +4882,16 @@
           <w:sz w:val="28"/>
           <w:szCs w:val="28"/>
         </w:rPr>
-        <w:t>We are t</w:t>
+        <w:t>We</w:t>
+      </w:r>
+      <w:proofErr w:type="gramEnd"/>
+      <w:r>
+        <w:rPr>
+          <w:rFonts w:ascii="Calibri" w:hAnsi="Calibri" w:cs="Calibri"/>
+          <w:sz w:val="28"/>
+          <w:szCs w:val="28"/>
+        </w:rPr>
+        <w:t xml:space="preserve"> are t</w:t>
       </w:r>
       <w:r>
         <w:rPr>
@@ -4449,6 +4919,7 @@
         </w:rPr>
         <w:t xml:space="preserve"> erotic content is AI-generated vs real on sexual arousal – all erotic images were </w:t>
       </w:r>
+      <w:proofErr w:type="gramStart"/>
       <w:r>
         <w:rPr>
           <w:rFonts w:ascii="Calibri" w:hAnsi="Calibri" w:cs="Calibri"/>
@@ -4463,7 +4934,16 @@
           <w:sz w:val="28"/>
           <w:szCs w:val="28"/>
         </w:rPr>
-        <w:t>real photographs (mild deception)</w:t>
+        <w:t>real</w:t>
+      </w:r>
+      <w:proofErr w:type="gramEnd"/>
+      <w:r>
+        <w:rPr>
+          <w:rFonts w:ascii="Calibri" w:hAnsi="Calibri" w:cs="Calibri"/>
+          <w:sz w:val="28"/>
+          <w:szCs w:val="28"/>
+        </w:rPr>
+        <w:t xml:space="preserve"> photographs (mild deception)</w:t>
       </w:r>
     </w:p>
     <w:p>
@@ -4479,6 +4959,7 @@
           <w:szCs w:val="28"/>
         </w:rPr>
       </w:pPr>
+      <w:proofErr w:type="gramStart"/>
       <w:r>
         <w:rPr>
           <w:rFonts w:ascii="Calibri" w:hAnsi="Calibri" w:cs="Calibri"/>
@@ -4493,7 +4974,16 @@
           <w:sz w:val="28"/>
           <w:szCs w:val="28"/>
         </w:rPr>
-        <w:t>Also examining interoception</w:t>
+        <w:t>Also</w:t>
+      </w:r>
+      <w:proofErr w:type="gramEnd"/>
+      <w:r>
+        <w:rPr>
+          <w:rFonts w:ascii="Calibri" w:hAnsi="Calibri" w:cs="Calibri"/>
+          <w:sz w:val="28"/>
+          <w:szCs w:val="28"/>
+        </w:rPr>
+        <w:t xml:space="preserve"> examining interoception</w:t>
       </w:r>
       <w:r>
         <w:rPr>
@@ -4565,6 +5055,7 @@
           <w:szCs w:val="28"/>
         </w:rPr>
       </w:pPr>
+      <w:proofErr w:type="gramStart"/>
       <w:r>
         <w:rPr>
           <w:rFonts w:ascii="Calibri" w:hAnsi="Calibri" w:cs="Calibri"/>
@@ -4579,7 +5070,16 @@
           <w:sz w:val="28"/>
           <w:szCs w:val="28"/>
         </w:rPr>
-        <w:t>Any questions?</w:t>
+        <w:t>Any</w:t>
+      </w:r>
+      <w:proofErr w:type="gramEnd"/>
+      <w:r>
+        <w:rPr>
+          <w:rFonts w:ascii="Calibri" w:hAnsi="Calibri" w:cs="Calibri"/>
+          <w:sz w:val="28"/>
+          <w:szCs w:val="28"/>
+        </w:rPr>
+        <w:t xml:space="preserve"> questions?</w:t>
       </w:r>
     </w:p>
     <w:sectPr>

</xml_diff>